<commit_message>
Ebook : ajout de schémas explicatifs et design plus commercial
- 9 schémas vectoriels originaux (diagrams.cjs) rasterisés en PNG via Chromium
  (render-figures.cjs) : niveaux d'intervention, anatomie smartphone/PC portable,
  méthode de diagnostic, court-circuit vs circuit ouvert, arbre « ne charge pas »,
  séquence de démarrage, structure de prix, AirPods réparable/non.
- Design commercial : couverture avec badge et chiffres-clés, page « Pourquoi ce
  guide » (grille de bénéfices), ouvertures de parties en bandeau, 4e de couverture.
- Schémas intégrés au Word (images embarquées) et au PDF (SVG inline).
- Ebook porté à 31 pages.

Co-Authored-By: Claude Opus 4.8 <noreply@anthropic.com>
Claude-Session: https://claude.ai/code/session_01F9fQ6ALPCxv4JUh6nwiR3h
</commit_message>
<xml_diff>
--- a/ebook/Guide-Reparation.docx
+++ b/ebook/Guide-Reparation.docx
@@ -4,7 +4,60 @@
   <w:body>
     <w:p>
       <w:pPr>
-        <w:spacing w:before="2600"/>
+        <w:spacing w:before="2400"/>
+      </w:pPr>
+    </w:p>
+    <w:tbl>
+      <w:tblPr>
+        <w:tblW w:type="pct" w:w="30%"/>
+        <w:jc w:val="center"/>
+        <w:tblBorders>
+          <w:top w:val="none" w:color="FFFFFF" w:sz="0"/>
+          <w:left w:val="none" w:color="FFFFFF" w:sz="0"/>
+          <w:bottom w:val="none" w:color="FFFFFF" w:sz="0"/>
+          <w:right w:val="none" w:color="FFFFFF" w:sz="0"/>
+          <w:insideH w:val="none" w:color="FFFFFF" w:sz="0"/>
+          <w:insideV w:val="none" w:color="FFFFFF" w:sz="0"/>
+        </w:tblBorders>
+      </w:tblPr>
+      <w:tblGrid>
+        <w:gridCol w:w="2800"/>
+      </w:tblGrid>
+      <w:tr>
+        <w:tc>
+          <w:tcPr>
+            <w:tcW w:type="dxa" w:w="2800"/>
+            <w:shd w:fill="C0392B" w:color="auto" w:val="clear"/>
+            <w:tcMar>
+              <w:top w:type="dxa" w:w="60"/>
+              <w:left w:type="dxa" w:w="120"/>
+              <w:bottom w:type="dxa" w:w="60"/>
+              <w:right w:type="dxa" w:w="120"/>
+            </w:tcMar>
+          </w:tcPr>
+          <w:p>
+            <w:pPr>
+              <w:jc w:val="center"/>
+            </w:pPr>
+            <w:r>
+              <w:rPr>
+                <w:rFonts w:ascii="Calibri" w:cs="Calibri" w:eastAsia="Calibri" w:hAnsi="Calibri"/>
+                <w:b/>
+                <w:bCs/>
+                <w:color w:val="FFFFFF"/>
+                <w:spacing w:val="40"/>
+                <w:sz w:val="17"/>
+                <w:szCs w:val="17"/>
+              </w:rPr>
+              <w:t xml:space="preserve">ÉDITION COMPLÈTE · 2026</w:t>
+            </w:r>
+          </w:p>
+        </w:tc>
+      </w:tr>
+    </w:tbl>
+    <w:p>
+      <w:pPr>
+        <w:spacing w:after="160"/>
       </w:pPr>
     </w:p>
     <w:p>
@@ -99,7 +152,93 @@
     </w:p>
     <w:p>
       <w:pPr>
-        <w:spacing w:before="3200"/>
+        <w:spacing w:after="120" w:before="2600"/>
+        <w:jc w:val="center"/>
+      </w:pPr>
+      <w:r>
+        <w:rPr>
+          <w:rFonts w:ascii="Calibri" w:cs="Calibri" w:eastAsia="Calibri" w:hAnsi="Calibri"/>
+          <w:b/>
+          <w:bCs/>
+          <w:color w:val="1F3A5F"/>
+          <w:sz w:val="28"/>
+          <w:szCs w:val="28"/>
+        </w:rPr>
+        <w:t xml:space="preserve">10 </w:t>
+      </w:r>
+      <w:r>
+        <w:rPr>
+          <w:rFonts w:ascii="Calibri" w:cs="Calibri" w:eastAsia="Calibri" w:hAnsi="Calibri"/>
+          <w:color w:val="555555"/>
+          <w:sz w:val="18"/>
+          <w:szCs w:val="18"/>
+        </w:rPr>
+        <w:t xml:space="preserve">parties   ·   </w:t>
+      </w:r>
+      <w:r>
+        <w:rPr>
+          <w:rFonts w:ascii="Calibri" w:cs="Calibri" w:eastAsia="Calibri" w:hAnsi="Calibri"/>
+          <w:b/>
+          <w:bCs/>
+          <w:color w:val="1F3A5F"/>
+          <w:sz w:val="28"/>
+          <w:szCs w:val="28"/>
+        </w:rPr>
+        <w:t xml:space="preserve">9 </w:t>
+      </w:r>
+      <w:r>
+        <w:rPr>
+          <w:rFonts w:ascii="Calibri" w:cs="Calibri" w:eastAsia="Calibri" w:hAnsi="Calibri"/>
+          <w:color w:val="555555"/>
+          <w:sz w:val="18"/>
+          <w:szCs w:val="18"/>
+        </w:rPr>
+        <w:t xml:space="preserve">schémas   ·   </w:t>
+      </w:r>
+      <w:r>
+        <w:rPr>
+          <w:rFonts w:ascii="Calibri" w:cs="Calibri" w:eastAsia="Calibri" w:hAnsi="Calibri"/>
+          <w:b/>
+          <w:bCs/>
+          <w:color w:val="1F3A5F"/>
+          <w:sz w:val="28"/>
+          <w:szCs w:val="28"/>
+        </w:rPr>
+        <w:t xml:space="preserve">5 </w:t>
+      </w:r>
+      <w:r>
+        <w:rPr>
+          <w:rFonts w:ascii="Calibri" w:cs="Calibri" w:eastAsia="Calibri" w:hAnsi="Calibri"/>
+          <w:color w:val="555555"/>
+          <w:sz w:val="18"/>
+          <w:szCs w:val="18"/>
+        </w:rPr>
+        <w:t xml:space="preserve">familles d’appareils   ·   </w:t>
+      </w:r>
+      <w:r>
+        <w:rPr>
+          <w:rFonts w:ascii="Calibri" w:cs="Calibri" w:eastAsia="Calibri" w:hAnsi="Calibri"/>
+          <w:b/>
+          <w:bCs/>
+          <w:color w:val="1F3A5F"/>
+          <w:sz w:val="28"/>
+          <w:szCs w:val="28"/>
+        </w:rPr>
+        <w:t xml:space="preserve">3 </w:t>
+      </w:r>
+      <w:r>
+        <w:rPr>
+          <w:rFonts w:ascii="Calibri" w:cs="Calibri" w:eastAsia="Calibri" w:hAnsi="Calibri"/>
+          <w:color w:val="555555"/>
+          <w:sz w:val="18"/>
+          <w:szCs w:val="18"/>
+        </w:rPr>
+        <w:t xml:space="preserve">niveaux</w:t>
+      </w:r>
+    </w:p>
+    <w:p>
+      <w:pPr>
+        <w:spacing w:before="200"/>
         <w:jc w:val="center"/>
       </w:pPr>
       <w:r>
@@ -294,28 +433,6 @@
       </w:pPr>
     </w:p>
     <w:p>
-      <w:r>
-        <w:br w:type="page"/>
-      </w:r>
-    </w:p>
-    <w:p>
-      <w:pPr>
-        <w:pStyle w:val="Heading1"/>
-        <w:spacing w:after="140" w:before="280"/>
-      </w:pPr>
-      <w:r>
-        <w:rPr>
-          <w:rFonts w:ascii="Calibri" w:cs="Calibri" w:eastAsia="Calibri" w:hAnsi="Calibri"/>
-          <w:b/>
-          <w:bCs/>
-          <w:color w:val="1F3A5F"/>
-          <w:sz w:val="32"/>
-          <w:szCs w:val="32"/>
-        </w:rPr>
-        <w:t xml:space="preserve">Partie 1 — Les fondamentaux</w:t>
-      </w:r>
-    </w:p>
-    <w:p>
       <w:pPr>
         <w:pStyle w:val="Heading2"/>
         <w:spacing w:after="100" w:before="220"/>
@@ -329,7 +446,7 @@
           <w:sz w:val="26"/>
           <w:szCs w:val="26"/>
         </w:rPr>
-        <w:t xml:space="preserve">1. Le métier de réparateur : panorama</w:t>
+        <w:t xml:space="preserve">Pourquoi ce guide</w:t>
       </w:r>
     </w:p>
     <w:p>
@@ -343,67 +460,479 @@
           <w:sz w:val="22"/>
           <w:szCs w:val="22"/>
         </w:rPr>
-        <w:t xml:space="preserve">Le réparateur d'appareils électroniques intervient sur des produits grand public de plus en plus complexes et de plus en plus fermés. Le métier se divise en trois grands niveaux d'intervention, qu'il faut bien distinguer car ils demandent des outils, des compétences et des investissements très différents.</w:t>
-      </w:r>
-    </w:p>
-    <w:p>
-      <w:pPr>
-        <w:pStyle w:val="ListParagraph"/>
-        <w:numPr>
-          <w:ilvl w:val="0"/>
-          <w:numId w:val="2"/>
-        </w:numPr>
-        <w:spacing w:after="60" w:line="264"/>
-      </w:pPr>
-      <w:r>
-        <w:rPr>
-          <w:rFonts w:ascii="Calibri" w:cs="Calibri" w:eastAsia="Calibri" w:hAnsi="Calibri"/>
-          <w:sz w:val="22"/>
-          <w:szCs w:val="22"/>
-        </w:rPr>
-        <w:t xml:space="preserve">Niveau 1 — Remplacement de modules (« level 1 » / plug-and-play). On remplace une pièce complète : écran, batterie, connecteur de charge sur nappe, caméra. C'est 80 à 90 % de l'activité d'une boutique et cela ne demande pas de soudure. C'est par là que tout le monde commence.</w:t>
-      </w:r>
-    </w:p>
-    <w:p>
-      <w:pPr>
-        <w:pStyle w:val="ListParagraph"/>
-        <w:numPr>
-          <w:ilvl w:val="0"/>
-          <w:numId w:val="2"/>
-        </w:numPr>
-        <w:spacing w:after="60" w:line="264"/>
-      </w:pPr>
-      <w:r>
-        <w:rPr>
-          <w:rFonts w:ascii="Calibri" w:cs="Calibri" w:eastAsia="Calibri" w:hAnsi="Calibri"/>
-          <w:sz w:val="22"/>
-          <w:szCs w:val="22"/>
-        </w:rPr>
-        <w:t xml:space="preserve">Niveau 2 — Micro-soudure de composants. On répare la carte mère elle-même : remplacer un connecteur soudé, une puce de gestion de charge, refaire des pistes. Demande une station à air chaud, un fer de précision, un microscope. Marges élevées, concurrence plus faible.</w:t>
-      </w:r>
-    </w:p>
-    <w:p>
-      <w:pPr>
-        <w:pStyle w:val="ListParagraph"/>
-        <w:numPr>
-          <w:ilvl w:val="0"/>
-          <w:numId w:val="2"/>
-        </w:numPr>
-        <w:spacing w:after="60" w:line="264"/>
-      </w:pPr>
-      <w:r>
-        <w:rPr>
-          <w:rFonts w:ascii="Calibri" w:cs="Calibri" w:eastAsia="Calibri" w:hAnsi="Calibri"/>
-          <w:sz w:val="22"/>
-          <w:szCs w:val="22"/>
-        </w:rPr>
-        <w:t xml:space="preserve">Niveau 3 — Reballing et reprogrammation. Rebilling de processeurs/mémoires (BGA), reprogrammation d'EEPROM, récupération de données sur puce NAND. Très spécialisé, matériel coûteux, clientèle souvent inter-professionnelle (autres réparateurs qui vous sous-traitent leurs cas difficiles).</w:t>
-      </w:r>
-    </w:p>
+        <w:t xml:space="preserve">Parce que réparer soi-même, c'est économiser des centaines d'euros, éviter le gaspillage, et — si vous le souhaitez — bâtir une activité rentable dès les premières réparations. Ce guide condense l'essentiel pour passer de « je n'ose pas ouvrir » à « je diagnostique et je répare avec méthode ».</w:t>
+      </w:r>
+    </w:p>
+    <w:tbl>
+      <w:tblPr>
+        <w:tblW w:type="pct" w:w="100%"/>
+        <w:tblBorders>
+          <w:top w:val="none" w:color="FFFFFF" w:sz="0"/>
+          <w:left w:val="none" w:color="FFFFFF" w:sz="0"/>
+          <w:bottom w:val="none" w:color="FFFFFF" w:sz="0"/>
+          <w:right w:val="none" w:color="FFFFFF" w:sz="0"/>
+          <w:insideH w:val="single" w:color="FFFFFF" w:sz="6"/>
+          <w:insideV w:val="single" w:color="FFFFFF" w:sz="12"/>
+        </w:tblBorders>
+      </w:tblPr>
+      <w:tblGrid>
+        <w:gridCol w:w="4680"/>
+        <w:gridCol w:w="4680"/>
+      </w:tblGrid>
+      <w:tr>
+        <w:tc>
+          <w:tcPr>
+            <w:tcW w:type="dxa" w:w="4680"/>
+            <w:shd w:fill="F4F8FC" w:color="auto" w:val="clear"/>
+            <w:tcMar>
+              <w:top w:type="dxa" w:w="120"/>
+              <w:left w:type="dxa" w:w="160"/>
+              <w:bottom w:type="dxa" w:w="120"/>
+              <w:right w:type="dxa" w:w="160"/>
+            </w:tcMar>
+          </w:tcPr>
+          <w:p>
+            <w:pPr>
+              <w:spacing w:after="30"/>
+            </w:pPr>
+            <w:r>
+              <w:rPr>
+                <w:rFonts w:ascii="Calibri" w:cs="Calibri" w:eastAsia="Calibri" w:hAnsi="Calibri"/>
+                <w:b/>
+                <w:bCs/>
+                <w:color w:val="1F3A5F"/>
+                <w:sz w:val="21"/>
+                <w:szCs w:val="21"/>
+              </w:rPr>
+              <w:t xml:space="preserve">5 familles d'appareils</w:t>
+            </w:r>
+          </w:p>
+          <w:p>
+            <w:r>
+              <w:rPr>
+                <w:rFonts w:ascii="Calibri" w:cs="Calibri" w:eastAsia="Calibri" w:hAnsi="Calibri"/>
+                <w:color w:val="4A5563"/>
+                <w:sz w:val="18"/>
+                <w:szCs w:val="18"/>
+              </w:rPr>
+              <w:t xml:space="preserve">Smartphones, PC portables, tablettes, smartwatchs et AirPods réunis dans un seul guide.</w:t>
+            </w:r>
+          </w:p>
+        </w:tc>
+        <w:tc>
+          <w:tcPr>
+            <w:tcW w:type="dxa" w:w="4680"/>
+            <w:shd w:fill="F4F8FC" w:color="auto" w:val="clear"/>
+            <w:tcMar>
+              <w:top w:type="dxa" w:w="120"/>
+              <w:left w:type="dxa" w:w="160"/>
+              <w:bottom w:type="dxa" w:w="120"/>
+              <w:right w:type="dxa" w:w="160"/>
+            </w:tcMar>
+          </w:tcPr>
+          <w:p>
+            <w:pPr>
+              <w:spacing w:after="30"/>
+            </w:pPr>
+            <w:r>
+              <w:rPr>
+                <w:rFonts w:ascii="Calibri" w:cs="Calibri" w:eastAsia="Calibri" w:hAnsi="Calibri"/>
+                <w:b/>
+                <w:bCs/>
+                <w:color w:val="1F3A5F"/>
+                <w:sz w:val="21"/>
+                <w:szCs w:val="21"/>
+              </w:rPr>
+              <w:t xml:space="preserve">Du zéro au pro</w:t>
+            </w:r>
+          </w:p>
+          <w:p>
+            <w:r>
+              <w:rPr>
+                <w:rFonts w:ascii="Calibri" w:cs="Calibri" w:eastAsia="Calibri" w:hAnsi="Calibri"/>
+                <w:color w:val="4A5563"/>
+                <w:sz w:val="18"/>
+                <w:szCs w:val="18"/>
+              </w:rPr>
+              <w:t xml:space="preserve">Aucun prérequis. On démarre aux bases et on monte jusqu'à la micro-soudure.</w:t>
+            </w:r>
+          </w:p>
+        </w:tc>
+      </w:tr>
+      <w:tr>
+        <w:tc>
+          <w:tcPr>
+            <w:tcW w:type="dxa" w:w="4680"/>
+            <w:tcBorders>
+              <w:top w:val="none" w:color="FFFFFF" w:sz="0"/>
+              <w:left w:val="none" w:color="FFFFFF" w:sz="0"/>
+              <w:bottom w:val="none" w:color="FFFFFF" w:sz="0"/>
+              <w:right w:val="none" w:color="FFFFFF" w:sz="0"/>
+            </w:tcBorders>
+          </w:tcPr>
+          <w:p>
+            <w:pPr>
+              <w:spacing w:after="40"/>
+            </w:pPr>
+          </w:p>
+        </w:tc>
+        <w:tc>
+          <w:tcPr>
+            <w:tcW w:type="dxa" w:w="4680"/>
+            <w:tcBorders>
+              <w:top w:val="none" w:color="FFFFFF" w:sz="0"/>
+              <w:left w:val="none" w:color="FFFFFF" w:sz="0"/>
+              <w:bottom w:val="none" w:color="FFFFFF" w:sz="0"/>
+              <w:right w:val="none" w:color="FFFFFF" w:sz="0"/>
+            </w:tcBorders>
+          </w:tcPr>
+          <w:p>
+            <w:pPr>
+              <w:spacing w:after="40"/>
+            </w:pPr>
+          </w:p>
+        </w:tc>
+      </w:tr>
+      <w:tr>
+        <w:tc>
+          <w:tcPr>
+            <w:tcW w:type="dxa" w:w="4680"/>
+            <w:shd w:fill="F4F8FC" w:color="auto" w:val="clear"/>
+            <w:tcMar>
+              <w:top w:type="dxa" w:w="120"/>
+              <w:left w:type="dxa" w:w="160"/>
+              <w:bottom w:type="dxa" w:w="120"/>
+              <w:right w:type="dxa" w:w="160"/>
+            </w:tcMar>
+          </w:tcPr>
+          <w:p>
+            <w:pPr>
+              <w:spacing w:after="30"/>
+            </w:pPr>
+            <w:r>
+              <w:rPr>
+                <w:rFonts w:ascii="Calibri" w:cs="Calibri" w:eastAsia="Calibri" w:hAnsi="Calibri"/>
+                <w:b/>
+                <w:bCs/>
+                <w:color w:val="1F3A5F"/>
+                <w:sz w:val="21"/>
+                <w:szCs w:val="21"/>
+              </w:rPr>
+              <w:t xml:space="preserve">La méthode avant la pièce</w:t>
+            </w:r>
+          </w:p>
+          <w:p>
+            <w:r>
+              <w:rPr>
+                <w:rFonts w:ascii="Calibri" w:cs="Calibri" w:eastAsia="Calibri" w:hAnsi="Calibri"/>
+                <w:color w:val="4A5563"/>
+                <w:sz w:val="18"/>
+                <w:szCs w:val="18"/>
+              </w:rPr>
+              <w:t xml:space="preserve">Un système de diagnostic clair pour réparer la cause, pas au hasard.</w:t>
+            </w:r>
+          </w:p>
+        </w:tc>
+        <w:tc>
+          <w:tcPr>
+            <w:tcW w:type="dxa" w:w="4680"/>
+            <w:shd w:fill="F4F8FC" w:color="auto" w:val="clear"/>
+            <w:tcMar>
+              <w:top w:type="dxa" w:w="120"/>
+              <w:left w:type="dxa" w:w="160"/>
+              <w:bottom w:type="dxa" w:w="120"/>
+              <w:right w:type="dxa" w:w="160"/>
+            </w:tcMar>
+          </w:tcPr>
+          <w:p>
+            <w:pPr>
+              <w:spacing w:after="30"/>
+            </w:pPr>
+            <w:r>
+              <w:rPr>
+                <w:rFonts w:ascii="Calibri" w:cs="Calibri" w:eastAsia="Calibri" w:hAnsi="Calibri"/>
+                <w:b/>
+                <w:bCs/>
+                <w:color w:val="1F3A5F"/>
+                <w:sz w:val="21"/>
+                <w:szCs w:val="21"/>
+              </w:rPr>
+              <w:t xml:space="preserve">Des schémas explicatifs</w:t>
+            </w:r>
+          </w:p>
+          <w:p>
+            <w:r>
+              <w:rPr>
+                <w:rFonts w:ascii="Calibri" w:cs="Calibri" w:eastAsia="Calibri" w:hAnsi="Calibri"/>
+                <w:color w:val="4A5563"/>
+                <w:sz w:val="18"/>
+                <w:szCs w:val="18"/>
+              </w:rPr>
+              <w:t xml:space="preserve">Des visuels conçus pour comprendre d'un coup d'œil, pas des pavés de texte.</w:t>
+            </w:r>
+          </w:p>
+        </w:tc>
+      </w:tr>
+      <w:tr>
+        <w:tc>
+          <w:tcPr>
+            <w:tcW w:type="dxa" w:w="4680"/>
+            <w:tcBorders>
+              <w:top w:val="none" w:color="FFFFFF" w:sz="0"/>
+              <w:left w:val="none" w:color="FFFFFF" w:sz="0"/>
+              <w:bottom w:val="none" w:color="FFFFFF" w:sz="0"/>
+              <w:right w:val="none" w:color="FFFFFF" w:sz="0"/>
+            </w:tcBorders>
+          </w:tcPr>
+          <w:p>
+            <w:pPr>
+              <w:spacing w:after="40"/>
+            </w:pPr>
+          </w:p>
+        </w:tc>
+        <w:tc>
+          <w:tcPr>
+            <w:tcW w:type="dxa" w:w="4680"/>
+            <w:tcBorders>
+              <w:top w:val="none" w:color="FFFFFF" w:sz="0"/>
+              <w:left w:val="none" w:color="FFFFFF" w:sz="0"/>
+              <w:bottom w:val="none" w:color="FFFFFF" w:sz="0"/>
+              <w:right w:val="none" w:color="FFFFFF" w:sz="0"/>
+            </w:tcBorders>
+          </w:tcPr>
+          <w:p>
+            <w:pPr>
+              <w:spacing w:after="40"/>
+            </w:pPr>
+          </w:p>
+        </w:tc>
+      </w:tr>
+      <w:tr>
+        <w:tc>
+          <w:tcPr>
+            <w:tcW w:type="dxa" w:w="4680"/>
+            <w:shd w:fill="F4F8FC" w:color="auto" w:val="clear"/>
+            <w:tcMar>
+              <w:top w:type="dxa" w:w="120"/>
+              <w:left w:type="dxa" w:w="160"/>
+              <w:bottom w:type="dxa" w:w="120"/>
+              <w:right w:type="dxa" w:w="160"/>
+            </w:tcMar>
+          </w:tcPr>
+          <w:p>
+            <w:pPr>
+              <w:spacing w:after="30"/>
+            </w:pPr>
+            <w:r>
+              <w:rPr>
+                <w:rFonts w:ascii="Calibri" w:cs="Calibri" w:eastAsia="Calibri" w:hAnsi="Calibri"/>
+                <w:b/>
+                <w:bCs/>
+                <w:color w:val="1F3A5F"/>
+                <w:sz w:val="21"/>
+                <w:szCs w:val="21"/>
+              </w:rPr>
+              <w:t xml:space="preserve">Le volet business</w:t>
+            </w:r>
+          </w:p>
+          <w:p>
+            <w:r>
+              <w:rPr>
+                <w:rFonts w:ascii="Calibri" w:cs="Calibri" w:eastAsia="Calibri" w:hAnsi="Calibri"/>
+                <w:color w:val="4A5563"/>
+                <w:sz w:val="18"/>
+                <w:szCs w:val="18"/>
+              </w:rPr>
+              <w:t xml:space="preserve">Tarifs, marges, fournisseurs, garantie, marketing : de la compétence à la rentabilité.</w:t>
+            </w:r>
+          </w:p>
+        </w:tc>
+        <w:tc>
+          <w:tcPr>
+            <w:tcW w:type="dxa" w:w="4680"/>
+            <w:shd w:fill="F4F8FC" w:color="auto" w:val="clear"/>
+            <w:tcMar>
+              <w:top w:type="dxa" w:w="120"/>
+              <w:left w:type="dxa" w:w="160"/>
+              <w:bottom w:type="dxa" w:w="120"/>
+              <w:right w:type="dxa" w:w="160"/>
+            </w:tcMar>
+          </w:tcPr>
+          <w:p>
+            <w:pPr>
+              <w:spacing w:after="30"/>
+            </w:pPr>
+            <w:r>
+              <w:rPr>
+                <w:rFonts w:ascii="Calibri" w:cs="Calibri" w:eastAsia="Calibri" w:hAnsi="Calibri"/>
+                <w:b/>
+                <w:bCs/>
+                <w:color w:val="1F3A5F"/>
+                <w:sz w:val="21"/>
+                <w:szCs w:val="21"/>
+              </w:rPr>
+              <w:t xml:space="preserve">Sécurité &amp; cadre légal</w:t>
+            </w:r>
+          </w:p>
+          <w:p>
+            <w:r>
+              <w:rPr>
+                <w:rFonts w:ascii="Calibri" w:cs="Calibri" w:eastAsia="Calibri" w:hAnsi="Calibri"/>
+                <w:color w:val="4A5563"/>
+                <w:sz w:val="18"/>
+                <w:szCs w:val="18"/>
+              </w:rPr>
+              <w:t xml:space="preserve">Batteries lithium, données clients, verrous : les bons réflexes dès le départ.</w:t>
+            </w:r>
+          </w:p>
+        </w:tc>
+      </w:tr>
+      <w:tr>
+        <w:tc>
+          <w:tcPr>
+            <w:tcW w:type="dxa" w:w="4680"/>
+            <w:tcBorders>
+              <w:top w:val="none" w:color="FFFFFF" w:sz="0"/>
+              <w:left w:val="none" w:color="FFFFFF" w:sz="0"/>
+              <w:bottom w:val="none" w:color="FFFFFF" w:sz="0"/>
+              <w:right w:val="none" w:color="FFFFFF" w:sz="0"/>
+            </w:tcBorders>
+          </w:tcPr>
+          <w:p>
+            <w:pPr>
+              <w:spacing w:after="40"/>
+            </w:pPr>
+          </w:p>
+        </w:tc>
+        <w:tc>
+          <w:tcPr>
+            <w:tcW w:type="dxa" w:w="4680"/>
+            <w:tcBorders>
+              <w:top w:val="none" w:color="FFFFFF" w:sz="0"/>
+              <w:left w:val="none" w:color="FFFFFF" w:sz="0"/>
+              <w:bottom w:val="none" w:color="FFFFFF" w:sz="0"/>
+              <w:right w:val="none" w:color="FFFFFF" w:sz="0"/>
+            </w:tcBorders>
+          </w:tcPr>
+          <w:p>
+            <w:pPr>
+              <w:spacing w:after="40"/>
+            </w:pPr>
+          </w:p>
+        </w:tc>
+      </w:tr>
+    </w:tbl>
     <w:p>
       <w:pPr>
         <w:spacing w:after="80"/>
       </w:pPr>
+    </w:p>
+    <w:p>
+      <w:r>
+        <w:br w:type="page"/>
+      </w:r>
+    </w:p>
+    <w:p>
+      <w:r>
+        <w:br w:type="page"/>
+      </w:r>
+    </w:p>
+    <w:p>
+      <w:pPr>
+        <w:pStyle w:val="Heading1"/>
+        <w:spacing w:after="0" w:before="0"/>
+      </w:pPr>
+      <w:r>
+        <w:rPr>
+          <w:rFonts w:ascii="Calibri" w:cs="Calibri" w:eastAsia="Calibri" w:hAnsi="Calibri"/>
+          <w:color w:val="FFFFFF"/>
+          <w:sz w:val="2"/>
+          <w:szCs w:val="2"/>
+        </w:rPr>
+        <w:t xml:space="preserve">Partie 1 — Les fondamentaux</w:t>
+      </w:r>
+    </w:p>
+    <w:tbl>
+      <w:tblPr>
+        <w:tblW w:type="pct" w:w="100%"/>
+        <w:tblBorders>
+          <w:top w:val="none" w:color="FFFFFF" w:sz="0"/>
+          <w:left w:val="none" w:color="FFFFFF" w:sz="0"/>
+          <w:bottom w:val="none" w:color="FFFFFF" w:sz="0"/>
+          <w:right w:val="none" w:color="FFFFFF" w:sz="0"/>
+          <w:insideH w:val="none" w:color="FFFFFF" w:sz="0"/>
+          <w:insideV w:val="none" w:color="FFFFFF" w:sz="0"/>
+        </w:tblBorders>
+      </w:tblPr>
+      <w:tblGrid>
+        <w:gridCol w:w="9360"/>
+      </w:tblGrid>
+      <w:tr>
+        <w:tc>
+          <w:tcPr>
+            <w:tcW w:type="dxa" w:w="9360"/>
+            <w:shd w:fill="1F3A5F" w:color="auto" w:val="clear"/>
+            <w:tcMar>
+              <w:top w:type="dxa" w:w="300"/>
+              <w:left w:type="dxa" w:w="320"/>
+              <w:bottom w:type="dxa" w:w="320"/>
+              <w:right w:type="dxa" w:w="320"/>
+            </w:tcMar>
+          </w:tcPr>
+          <w:p>
+            <w:pPr>
+              <w:spacing w:after="40"/>
+            </w:pPr>
+            <w:r>
+              <w:rPr>
+                <w:rFonts w:ascii="Calibri" w:cs="Calibri" w:eastAsia="Calibri" w:hAnsi="Calibri"/>
+                <w:b/>
+                <w:bCs/>
+                <w:color w:val="9FC4E6"/>
+                <w:spacing w:val="60"/>
+                <w:sz w:val="20"/>
+                <w:szCs w:val="20"/>
+              </w:rPr>
+              <w:t xml:space="preserve">PARTIE 1</w:t>
+            </w:r>
+          </w:p>
+          <w:p>
+            <w:r>
+              <w:rPr>
+                <w:rFonts w:ascii="Calibri" w:cs="Calibri" w:eastAsia="Calibri" w:hAnsi="Calibri"/>
+                <w:b/>
+                <w:bCs/>
+                <w:color w:val="FFFFFF"/>
+                <w:sz w:val="40"/>
+                <w:szCs w:val="40"/>
+              </w:rPr>
+              <w:t xml:space="preserve">Les fondamentaux</w:t>
+            </w:r>
+          </w:p>
+        </w:tc>
+      </w:tr>
+    </w:tbl>
+    <w:p>
+      <w:pPr>
+        <w:spacing w:after="80"/>
+      </w:pPr>
+    </w:p>
+    <w:p>
+      <w:pPr>
+        <w:pStyle w:val="Heading2"/>
+        <w:spacing w:after="100" w:before="220"/>
+      </w:pPr>
+      <w:r>
+        <w:rPr>
+          <w:rFonts w:ascii="Calibri" w:cs="Calibri" w:eastAsia="Calibri" w:hAnsi="Calibri"/>
+          <w:b/>
+          <w:bCs/>
+          <w:color w:val="2E5E8C"/>
+          <w:sz w:val="26"/>
+          <w:szCs w:val="26"/>
+        </w:rPr>
+        <w:t xml:space="preserve">1. Le métier de réparateur : panorama</w:t>
+      </w:r>
     </w:p>
     <w:p>
       <w:pPr>
@@ -416,7 +945,143 @@
           <w:sz w:val="22"/>
           <w:szCs w:val="22"/>
         </w:rPr>
+        <w:t xml:space="preserve">Le réparateur d'appareils électroniques intervient sur des produits grand public de plus en plus complexes et de plus en plus fermés. Le métier se divise en trois grands niveaux d'intervention, qu'il faut bien distinguer car ils demandent des outils, des compétences et des investissements très différents.</w:t>
+      </w:r>
+    </w:p>
+    <w:p>
+      <w:pPr>
+        <w:pStyle w:val="ListParagraph"/>
+        <w:numPr>
+          <w:ilvl w:val="0"/>
+          <w:numId w:val="2"/>
+        </w:numPr>
+        <w:spacing w:after="60" w:line="264"/>
+      </w:pPr>
+      <w:r>
+        <w:rPr>
+          <w:rFonts w:ascii="Calibri" w:cs="Calibri" w:eastAsia="Calibri" w:hAnsi="Calibri"/>
+          <w:sz w:val="22"/>
+          <w:szCs w:val="22"/>
+        </w:rPr>
+        <w:t xml:space="preserve">Niveau 1 — Remplacement de modules (« level 1 » / plug-and-play). On remplace une pièce complète : écran, batterie, connecteur de charge sur nappe, caméra. C'est 80 à 90 % de l'activité d'une boutique et cela ne demande pas de soudure. C'est par là que tout le monde commence.</w:t>
+      </w:r>
+    </w:p>
+    <w:p>
+      <w:pPr>
+        <w:pStyle w:val="ListParagraph"/>
+        <w:numPr>
+          <w:ilvl w:val="0"/>
+          <w:numId w:val="2"/>
+        </w:numPr>
+        <w:spacing w:after="60" w:line="264"/>
+      </w:pPr>
+      <w:r>
+        <w:rPr>
+          <w:rFonts w:ascii="Calibri" w:cs="Calibri" w:eastAsia="Calibri" w:hAnsi="Calibri"/>
+          <w:sz w:val="22"/>
+          <w:szCs w:val="22"/>
+        </w:rPr>
+        <w:t xml:space="preserve">Niveau 2 — Micro-soudure de composants. On répare la carte mère elle-même : remplacer un connecteur soudé, une puce de gestion de charge, refaire des pistes. Demande une station à air chaud, un fer de précision, un microscope. Marges élevées, concurrence plus faible.</w:t>
+      </w:r>
+    </w:p>
+    <w:p>
+      <w:pPr>
+        <w:pStyle w:val="ListParagraph"/>
+        <w:numPr>
+          <w:ilvl w:val="0"/>
+          <w:numId w:val="2"/>
+        </w:numPr>
+        <w:spacing w:after="60" w:line="264"/>
+      </w:pPr>
+      <w:r>
+        <w:rPr>
+          <w:rFonts w:ascii="Calibri" w:cs="Calibri" w:eastAsia="Calibri" w:hAnsi="Calibri"/>
+          <w:sz w:val="22"/>
+          <w:szCs w:val="22"/>
+        </w:rPr>
+        <w:t xml:space="preserve">Niveau 3 — Reballing et reprogrammation. Rebilling de processeurs/mémoires (BGA), reprogrammation d'EEPROM, récupération de données sur puce NAND. Très spécialisé, matériel coûteux, clientèle souvent inter-professionnelle (autres réparateurs qui vous sous-traitent leurs cas difficiles).</w:t>
+      </w:r>
+    </w:p>
+    <w:p>
+      <w:pPr>
+        <w:spacing w:after="80"/>
+      </w:pPr>
+    </w:p>
+    <w:p>
+      <w:pPr>
+        <w:spacing w:after="120" w:line="276"/>
+        <w:jc w:val="both"/>
+      </w:pPr>
+      <w:r>
+        <w:rPr>
+          <w:rFonts w:ascii="Calibri" w:cs="Calibri" w:eastAsia="Calibri" w:hAnsi="Calibri"/>
+          <w:sz w:val="22"/>
+          <w:szCs w:val="22"/>
+        </w:rPr>
         <w:t xml:space="preserve">Beaucoup de professionnels vivent très bien du seul niveau 1. Monter vers les niveaux 2 et 3 augmente votre marge et vous permet de récupérer les cas que vos concurrents refusent, mais ce n'est pas obligatoire pour démarrer. Cet ebook couvre les trois.</w:t>
+      </w:r>
+    </w:p>
+    <w:p>
+      <w:pPr>
+        <w:spacing w:after="40" w:before="120"/>
+        <w:jc w:val="center"/>
+      </w:pPr>
+      <w:r>
+        <w:drawing>
+          <wp:inline distT="0" distB="0" distL="0" distR="0">
+            <wp:extent cx="4476750" cy="2143125"/>
+            <wp:effectExtent t="0" r="0" b="0" l="0"/>
+            <wp:docPr id="1" name="" descr="" title=""/>
+            <wp:cNvGraphicFramePr>
+              <a:graphicFrameLocks xmlns:a="http://schemas.openxmlformats.org/drawingml/2006/main" noChangeAspect="1"/>
+            </wp:cNvGraphicFramePr>
+            <a:graphic xmlns:a="http://schemas.openxmlformats.org/drawingml/2006/main">
+              <a:graphicData uri="http://schemas.openxmlformats.org/drawingml/2006/picture">
+                <pic:pic xmlns:pic="http://schemas.openxmlformats.org/drawingml/2006/picture">
+                  <pic:nvPicPr>
+                    <pic:cNvPr id="0" name="" descr=""/>
+                    <pic:cNvPicPr>
+                      <a:picLocks noChangeAspect="1" noChangeArrowheads="1"/>
+                    </pic:cNvPicPr>
+                  </pic:nvPicPr>
+                  <pic:blipFill>
+                    <a:blip r:embed="rId8" cstate="none"/>
+                    <a:srcRect/>
+                    <a:stretch>
+                      <a:fillRect/>
+                    </a:stretch>
+                  </pic:blipFill>
+                  <pic:spPr bwMode="auto">
+                    <a:xfrm>
+                      <a:off x="0" y="0"/>
+                      <a:ext cx="4476750" cy="2143125"/>
+                    </a:xfrm>
+                    <a:prstGeom prst="rect">
+                      <a:avLst/>
+                    </a:prstGeom>
+                  </pic:spPr>
+                </pic:pic>
+              </a:graphicData>
+            </a:graphic>
+          </wp:inline>
+        </w:drawing>
+      </w:r>
+    </w:p>
+    <w:p>
+      <w:pPr>
+        <w:spacing w:after="160"/>
+        <w:jc w:val="center"/>
+      </w:pPr>
+      <w:r>
+        <w:rPr>
+          <w:rFonts w:ascii="Calibri" w:cs="Calibri" w:eastAsia="Calibri" w:hAnsi="Calibri"/>
+          <w:i/>
+          <w:iCs/>
+          <w:color w:val="555555"/>
+          <w:sz w:val="17"/>
+          <w:szCs w:val="17"/>
+        </w:rPr>
+        <w:t xml:space="preserve">Les trois niveaux d'intervention : la valeur ajoutée et la rareté augmentent à mesure qu'on monte.</w:t>
       </w:r>
     </w:p>
     <w:p>
@@ -1239,6 +1904,69 @@
     </w:p>
     <w:p>
       <w:pPr>
+        <w:spacing w:after="40" w:before="120"/>
+        <w:jc w:val="center"/>
+      </w:pPr>
+      <w:r>
+        <w:drawing>
+          <wp:inline distT="0" distB="0" distL="0" distR="0">
+            <wp:extent cx="4476750" cy="1885950"/>
+            <wp:effectExtent t="0" r="0" b="0" l="0"/>
+            <wp:docPr id="1" name="" descr="" title=""/>
+            <wp:cNvGraphicFramePr>
+              <a:graphicFrameLocks xmlns:a="http://schemas.openxmlformats.org/drawingml/2006/main" noChangeAspect="1"/>
+            </wp:cNvGraphicFramePr>
+            <a:graphic xmlns:a="http://schemas.openxmlformats.org/drawingml/2006/main">
+              <a:graphicData uri="http://schemas.openxmlformats.org/drawingml/2006/picture">
+                <pic:pic xmlns:pic="http://schemas.openxmlformats.org/drawingml/2006/picture">
+                  <pic:nvPicPr>
+                    <pic:cNvPr id="0" name="" descr=""/>
+                    <pic:cNvPicPr>
+                      <a:picLocks noChangeAspect="1" noChangeArrowheads="1"/>
+                    </pic:cNvPicPr>
+                  </pic:nvPicPr>
+                  <pic:blipFill>
+                    <a:blip r:embed="rId9" cstate="none"/>
+                    <a:srcRect/>
+                    <a:stretch>
+                      <a:fillRect/>
+                    </a:stretch>
+                  </pic:blipFill>
+                  <pic:spPr bwMode="auto">
+                    <a:xfrm>
+                      <a:off x="0" y="0"/>
+                      <a:ext cx="4476750" cy="1885950"/>
+                    </a:xfrm>
+                    <a:prstGeom prst="rect">
+                      <a:avLst/>
+                    </a:prstGeom>
+                  </pic:spPr>
+                </pic:pic>
+              </a:graphicData>
+            </a:graphic>
+          </wp:inline>
+        </w:drawing>
+      </w:r>
+    </w:p>
+    <w:p>
+      <w:pPr>
+        <w:spacing w:after="160"/>
+        <w:jc w:val="center"/>
+      </w:pPr>
+      <w:r>
+        <w:rPr>
+          <w:rFonts w:ascii="Calibri" w:cs="Calibri" w:eastAsia="Calibri" w:hAnsi="Calibri"/>
+          <w:i/>
+          <w:iCs/>
+          <w:color w:val="555555"/>
+          <w:sz w:val="17"/>
+          <w:szCs w:val="17"/>
+        </w:rPr>
+        <w:t xml:space="preserve">Court-circuit et circuit ouvert : les deux situations à identifier au multimètre.</w:t>
+      </w:r>
+    </w:p>
+    <w:p>
+      <w:pPr>
         <w:pStyle w:val="Heading3"/>
         <w:spacing w:after="60" w:before="160"/>
       </w:pPr>
@@ -1266,6 +1994,69 @@
           <w:szCs w:val="22"/>
         </w:rPr>
         <w:t xml:space="preserve">Sur une carte mère, la « masse » (ground, GND) est la référence 0 V commune. À partir de la batterie ou du chargeur, des régulateurs créent plusieurs « rails » de tension (par ex. 1,8 V, 3,3 V…). Quand vous appuyez sur « marche », l'appareil exécute une séquence : alimentation principale → rails secondaires → horloge → processeur → chargement du logiciel de démarrage. Si la séquence se bloque à une étape, l'appareil ne démarre pas. Comprendre cette chaîne aide énormément au diagnostic des cartes mères.</w:t>
+      </w:r>
+    </w:p>
+    <w:p>
+      <w:pPr>
+        <w:spacing w:after="40" w:before="120"/>
+        <w:jc w:val="center"/>
+      </w:pPr>
+      <w:r>
+        <w:drawing>
+          <wp:inline distT="0" distB="0" distL="0" distR="0">
+            <wp:extent cx="4476750" cy="1495425"/>
+            <wp:effectExtent t="0" r="0" b="0" l="0"/>
+            <wp:docPr id="1" name="" descr="" title=""/>
+            <wp:cNvGraphicFramePr>
+              <a:graphicFrameLocks xmlns:a="http://schemas.openxmlformats.org/drawingml/2006/main" noChangeAspect="1"/>
+            </wp:cNvGraphicFramePr>
+            <a:graphic xmlns:a="http://schemas.openxmlformats.org/drawingml/2006/main">
+              <a:graphicData uri="http://schemas.openxmlformats.org/drawingml/2006/picture">
+                <pic:pic xmlns:pic="http://schemas.openxmlformats.org/drawingml/2006/picture">
+                  <pic:nvPicPr>
+                    <pic:cNvPr id="0" name="" descr=""/>
+                    <pic:cNvPicPr>
+                      <a:picLocks noChangeAspect="1" noChangeArrowheads="1"/>
+                    </pic:cNvPicPr>
+                  </pic:nvPicPr>
+                  <pic:blipFill>
+                    <a:blip r:embed="rId10" cstate="none"/>
+                    <a:srcRect/>
+                    <a:stretch>
+                      <a:fillRect/>
+                    </a:stretch>
+                  </pic:blipFill>
+                  <pic:spPr bwMode="auto">
+                    <a:xfrm>
+                      <a:off x="0" y="0"/>
+                      <a:ext cx="4476750" cy="1495425"/>
+                    </a:xfrm>
+                    <a:prstGeom prst="rect">
+                      <a:avLst/>
+                    </a:prstGeom>
+                  </pic:spPr>
+                </pic:pic>
+              </a:graphicData>
+            </a:graphic>
+          </wp:inline>
+        </w:drawing>
+      </w:r>
+    </w:p>
+    <w:p>
+      <w:pPr>
+        <w:spacing w:after="160"/>
+        <w:jc w:val="center"/>
+      </w:pPr>
+      <w:r>
+        <w:rPr>
+          <w:rFonts w:ascii="Calibri" w:cs="Calibri" w:eastAsia="Calibri" w:hAnsi="Calibri"/>
+          <w:i/>
+          <w:iCs/>
+          <w:color w:val="555555"/>
+          <w:sz w:val="17"/>
+          <w:szCs w:val="17"/>
+        </w:rPr>
+        <w:t xml:space="preserve">La séquence de démarrage : repérer la première étape manquante oriente tout le diagnostic.</w:t>
       </w:r>
     </w:p>
     <w:p>
@@ -2015,21 +2806,89 @@
       </w:r>
     </w:p>
     <w:p>
+      <w:r>
+        <w:br w:type="page"/>
+      </w:r>
+    </w:p>
+    <w:p>
       <w:pPr>
         <w:pStyle w:val="Heading1"/>
-        <w:spacing w:after="140" w:before="280"/>
-      </w:pPr>
-      <w:r>
-        <w:rPr>
-          <w:rFonts w:ascii="Calibri" w:cs="Calibri" w:eastAsia="Calibri" w:hAnsi="Calibri"/>
-          <w:b/>
-          <w:bCs/>
-          <w:color w:val="1F3A5F"/>
-          <w:sz w:val="32"/>
-          <w:szCs w:val="32"/>
+        <w:spacing w:after="0" w:before="0"/>
+      </w:pPr>
+      <w:r>
+        <w:rPr>
+          <w:rFonts w:ascii="Calibri" w:cs="Calibri" w:eastAsia="Calibri" w:hAnsi="Calibri"/>
+          <w:color w:val="FFFFFF"/>
+          <w:sz w:val="2"/>
+          <w:szCs w:val="2"/>
         </w:rPr>
         <w:t xml:space="preserve">Partie 2 — La méthode de diagnostic universelle</w:t>
       </w:r>
+    </w:p>
+    <w:tbl>
+      <w:tblPr>
+        <w:tblW w:type="pct" w:w="100%"/>
+        <w:tblBorders>
+          <w:top w:val="none" w:color="FFFFFF" w:sz="0"/>
+          <w:left w:val="none" w:color="FFFFFF" w:sz="0"/>
+          <w:bottom w:val="none" w:color="FFFFFF" w:sz="0"/>
+          <w:right w:val="none" w:color="FFFFFF" w:sz="0"/>
+          <w:insideH w:val="none" w:color="FFFFFF" w:sz="0"/>
+          <w:insideV w:val="none" w:color="FFFFFF" w:sz="0"/>
+        </w:tblBorders>
+      </w:tblPr>
+      <w:tblGrid>
+        <w:gridCol w:w="9360"/>
+      </w:tblGrid>
+      <w:tr>
+        <w:tc>
+          <w:tcPr>
+            <w:tcW w:type="dxa" w:w="9360"/>
+            <w:shd w:fill="1F3A5F" w:color="auto" w:val="clear"/>
+            <w:tcMar>
+              <w:top w:type="dxa" w:w="300"/>
+              <w:left w:type="dxa" w:w="320"/>
+              <w:bottom w:type="dxa" w:w="320"/>
+              <w:right w:type="dxa" w:w="320"/>
+            </w:tcMar>
+          </w:tcPr>
+          <w:p>
+            <w:pPr>
+              <w:spacing w:after="40"/>
+            </w:pPr>
+            <w:r>
+              <w:rPr>
+                <w:rFonts w:ascii="Calibri" w:cs="Calibri" w:eastAsia="Calibri" w:hAnsi="Calibri"/>
+                <w:b/>
+                <w:bCs/>
+                <w:color w:val="9FC4E6"/>
+                <w:spacing w:val="60"/>
+                <w:sz w:val="20"/>
+                <w:szCs w:val="20"/>
+              </w:rPr>
+              <w:t xml:space="preserve">PARTIE 2</w:t>
+            </w:r>
+          </w:p>
+          <w:p>
+            <w:r>
+              <w:rPr>
+                <w:rFonts w:ascii="Calibri" w:cs="Calibri" w:eastAsia="Calibri" w:hAnsi="Calibri"/>
+                <w:b/>
+                <w:bCs/>
+                <w:color w:val="FFFFFF"/>
+                <w:sz w:val="40"/>
+                <w:szCs w:val="40"/>
+              </w:rPr>
+              <w:t xml:space="preserve">La méthode de diagnostic universelle</w:t>
+            </w:r>
+          </w:p>
+        </w:tc>
+      </w:tr>
+    </w:tbl>
+    <w:p>
+      <w:pPr>
+        <w:spacing w:after="80"/>
+      </w:pPr>
     </w:p>
     <w:p>
       <w:pPr>
@@ -2175,6 +3034,69 @@
       <w:pPr>
         <w:spacing w:after="80"/>
       </w:pPr>
+    </w:p>
+    <w:p>
+      <w:pPr>
+        <w:spacing w:after="40" w:before="120"/>
+        <w:jc w:val="center"/>
+      </w:pPr>
+      <w:r>
+        <w:drawing>
+          <wp:inline distT="0" distB="0" distL="0" distR="0">
+            <wp:extent cx="4476750" cy="2143125"/>
+            <wp:effectExtent t="0" r="0" b="0" l="0"/>
+            <wp:docPr id="1" name="" descr="" title=""/>
+            <wp:cNvGraphicFramePr>
+              <a:graphicFrameLocks xmlns:a="http://schemas.openxmlformats.org/drawingml/2006/main" noChangeAspect="1"/>
+            </wp:cNvGraphicFramePr>
+            <a:graphic xmlns:a="http://schemas.openxmlformats.org/drawingml/2006/main">
+              <a:graphicData uri="http://schemas.openxmlformats.org/drawingml/2006/picture">
+                <pic:pic xmlns:pic="http://schemas.openxmlformats.org/drawingml/2006/picture">
+                  <pic:nvPicPr>
+                    <pic:cNvPr id="0" name="" descr=""/>
+                    <pic:cNvPicPr>
+                      <a:picLocks noChangeAspect="1" noChangeArrowheads="1"/>
+                    </pic:cNvPicPr>
+                  </pic:nvPicPr>
+                  <pic:blipFill>
+                    <a:blip r:embed="rId11" cstate="none"/>
+                    <a:srcRect/>
+                    <a:stretch>
+                      <a:fillRect/>
+                    </a:stretch>
+                  </pic:blipFill>
+                  <pic:spPr bwMode="auto">
+                    <a:xfrm>
+                      <a:off x="0" y="0"/>
+                      <a:ext cx="4476750" cy="2143125"/>
+                    </a:xfrm>
+                    <a:prstGeom prst="rect">
+                      <a:avLst/>
+                    </a:prstGeom>
+                  </pic:spPr>
+                </pic:pic>
+              </a:graphicData>
+            </a:graphic>
+          </wp:inline>
+        </w:drawing>
+      </w:r>
+    </w:p>
+    <w:p>
+      <w:pPr>
+        <w:spacing w:after="160"/>
+        <w:jc w:val="center"/>
+      </w:pPr>
+      <w:r>
+        <w:rPr>
+          <w:rFonts w:ascii="Calibri" w:cs="Calibri" w:eastAsia="Calibri" w:hAnsi="Calibri"/>
+          <w:i/>
+          <w:iCs/>
+          <w:color w:val="555555"/>
+          <w:sz w:val="17"/>
+          <w:szCs w:val="17"/>
+        </w:rPr>
+        <w:t xml:space="preserve">La méthode en 7 étapes, applicable à n'importe quel appareil.</w:t>
+      </w:r>
     </w:p>
     <w:tbl>
       <w:tblPr>
@@ -2336,21 +3258,89 @@
       </w:r>
     </w:p>
     <w:p>
+      <w:r>
+        <w:br w:type="page"/>
+      </w:r>
+    </w:p>
+    <w:p>
       <w:pPr>
         <w:pStyle w:val="Heading1"/>
-        <w:spacing w:after="140" w:before="280"/>
-      </w:pPr>
-      <w:r>
-        <w:rPr>
-          <w:rFonts w:ascii="Calibri" w:cs="Calibri" w:eastAsia="Calibri" w:hAnsi="Calibri"/>
-          <w:b/>
-          <w:bCs/>
-          <w:color w:val="1F3A5F"/>
-          <w:sz w:val="32"/>
-          <w:szCs w:val="32"/>
+        <w:spacing w:after="0" w:before="0"/>
+      </w:pPr>
+      <w:r>
+        <w:rPr>
+          <w:rFonts w:ascii="Calibri" w:cs="Calibri" w:eastAsia="Calibri" w:hAnsi="Calibri"/>
+          <w:color w:val="FFFFFF"/>
+          <w:sz w:val="2"/>
+          <w:szCs w:val="2"/>
         </w:rPr>
         <w:t xml:space="preserve">Partie 3 — Réparation des smartphones</w:t>
       </w:r>
+    </w:p>
+    <w:tbl>
+      <w:tblPr>
+        <w:tblW w:type="pct" w:w="100%"/>
+        <w:tblBorders>
+          <w:top w:val="none" w:color="FFFFFF" w:sz="0"/>
+          <w:left w:val="none" w:color="FFFFFF" w:sz="0"/>
+          <w:bottom w:val="none" w:color="FFFFFF" w:sz="0"/>
+          <w:right w:val="none" w:color="FFFFFF" w:sz="0"/>
+          <w:insideH w:val="none" w:color="FFFFFF" w:sz="0"/>
+          <w:insideV w:val="none" w:color="FFFFFF" w:sz="0"/>
+        </w:tblBorders>
+      </w:tblPr>
+      <w:tblGrid>
+        <w:gridCol w:w="9360"/>
+      </w:tblGrid>
+      <w:tr>
+        <w:tc>
+          <w:tcPr>
+            <w:tcW w:type="dxa" w:w="9360"/>
+            <w:shd w:fill="1F3A5F" w:color="auto" w:val="clear"/>
+            <w:tcMar>
+              <w:top w:type="dxa" w:w="300"/>
+              <w:left w:type="dxa" w:w="320"/>
+              <w:bottom w:type="dxa" w:w="320"/>
+              <w:right w:type="dxa" w:w="320"/>
+            </w:tcMar>
+          </w:tcPr>
+          <w:p>
+            <w:pPr>
+              <w:spacing w:after="40"/>
+            </w:pPr>
+            <w:r>
+              <w:rPr>
+                <w:rFonts w:ascii="Calibri" w:cs="Calibri" w:eastAsia="Calibri" w:hAnsi="Calibri"/>
+                <w:b/>
+                <w:bCs/>
+                <w:color w:val="9FC4E6"/>
+                <w:spacing w:val="60"/>
+                <w:sz w:val="20"/>
+                <w:szCs w:val="20"/>
+              </w:rPr>
+              <w:t xml:space="preserve">PARTIE 3</w:t>
+            </w:r>
+          </w:p>
+          <w:p>
+            <w:r>
+              <w:rPr>
+                <w:rFonts w:ascii="Calibri" w:cs="Calibri" w:eastAsia="Calibri" w:hAnsi="Calibri"/>
+                <w:b/>
+                <w:bCs/>
+                <w:color w:val="FFFFFF"/>
+                <w:sz w:val="40"/>
+                <w:szCs w:val="40"/>
+              </w:rPr>
+              <w:t xml:space="preserve">Réparation des smartphones</w:t>
+            </w:r>
+          </w:p>
+        </w:tc>
+      </w:tr>
+    </w:tbl>
+    <w:p>
+      <w:pPr>
+        <w:spacing w:after="80"/>
+      </w:pPr>
     </w:p>
     <w:p>
       <w:pPr>
@@ -2513,6 +3503,69 @@
       <w:pPr>
         <w:spacing w:after="80"/>
       </w:pPr>
+    </w:p>
+    <w:p>
+      <w:pPr>
+        <w:spacing w:after="40" w:before="120"/>
+        <w:jc w:val="center"/>
+      </w:pPr>
+      <w:r>
+        <w:drawing>
+          <wp:inline distT="0" distB="0" distL="0" distR="0">
+            <wp:extent cx="4476750" cy="2333625"/>
+            <wp:effectExtent t="0" r="0" b="0" l="0"/>
+            <wp:docPr id="1" name="" descr="" title=""/>
+            <wp:cNvGraphicFramePr>
+              <a:graphicFrameLocks xmlns:a="http://schemas.openxmlformats.org/drawingml/2006/main" noChangeAspect="1"/>
+            </wp:cNvGraphicFramePr>
+            <a:graphic xmlns:a="http://schemas.openxmlformats.org/drawingml/2006/main">
+              <a:graphicData uri="http://schemas.openxmlformats.org/drawingml/2006/picture">
+                <pic:pic xmlns:pic="http://schemas.openxmlformats.org/drawingml/2006/picture">
+                  <pic:nvPicPr>
+                    <pic:cNvPr id="0" name="" descr=""/>
+                    <pic:cNvPicPr>
+                      <a:picLocks noChangeAspect="1" noChangeArrowheads="1"/>
+                    </pic:cNvPicPr>
+                  </pic:nvPicPr>
+                  <pic:blipFill>
+                    <a:blip r:embed="rId12" cstate="none"/>
+                    <a:srcRect/>
+                    <a:stretch>
+                      <a:fillRect/>
+                    </a:stretch>
+                  </pic:blipFill>
+                  <pic:spPr bwMode="auto">
+                    <a:xfrm>
+                      <a:off x="0" y="0"/>
+                      <a:ext cx="4476750" cy="2333625"/>
+                    </a:xfrm>
+                    <a:prstGeom prst="rect">
+                      <a:avLst/>
+                    </a:prstGeom>
+                  </pic:spPr>
+                </pic:pic>
+              </a:graphicData>
+            </a:graphic>
+          </wp:inline>
+        </w:drawing>
+      </w:r>
+    </w:p>
+    <w:p>
+      <w:pPr>
+        <w:spacing w:after="160"/>
+        <w:jc w:val="center"/>
+      </w:pPr>
+      <w:r>
+        <w:rPr>
+          <w:rFonts w:ascii="Calibri" w:cs="Calibri" w:eastAsia="Calibri" w:hAnsi="Calibri"/>
+          <w:i/>
+          <w:iCs/>
+          <w:color w:val="555555"/>
+          <w:sz w:val="17"/>
+          <w:szCs w:val="17"/>
+        </w:rPr>
+        <w:t xml:space="preserve">Architecture type d'un smartphone : couches empilées et modules reliés par nappes.</w:t>
+      </w:r>
     </w:p>
     <w:p>
       <w:pPr>
@@ -3310,6 +4363,69 @@
     </w:p>
     <w:p>
       <w:pPr>
+        <w:spacing w:after="40" w:before="120"/>
+        <w:jc w:val="center"/>
+      </w:pPr>
+      <w:r>
+        <w:drawing>
+          <wp:inline distT="0" distB="0" distL="0" distR="0">
+            <wp:extent cx="4476750" cy="2333625"/>
+            <wp:effectExtent t="0" r="0" b="0" l="0"/>
+            <wp:docPr id="1" name="" descr="" title=""/>
+            <wp:cNvGraphicFramePr>
+              <a:graphicFrameLocks xmlns:a="http://schemas.openxmlformats.org/drawingml/2006/main" noChangeAspect="1"/>
+            </wp:cNvGraphicFramePr>
+            <a:graphic xmlns:a="http://schemas.openxmlformats.org/drawingml/2006/main">
+              <a:graphicData uri="http://schemas.openxmlformats.org/drawingml/2006/picture">
+                <pic:pic xmlns:pic="http://schemas.openxmlformats.org/drawingml/2006/picture">
+                  <pic:nvPicPr>
+                    <pic:cNvPr id="0" name="" descr=""/>
+                    <pic:cNvPicPr>
+                      <a:picLocks noChangeAspect="1" noChangeArrowheads="1"/>
+                    </pic:cNvPicPr>
+                  </pic:nvPicPr>
+                  <pic:blipFill>
+                    <a:blip r:embed="rId13" cstate="none"/>
+                    <a:srcRect/>
+                    <a:stretch>
+                      <a:fillRect/>
+                    </a:stretch>
+                  </pic:blipFill>
+                  <pic:spPr bwMode="auto">
+                    <a:xfrm>
+                      <a:off x="0" y="0"/>
+                      <a:ext cx="4476750" cy="2333625"/>
+                    </a:xfrm>
+                    <a:prstGeom prst="rect">
+                      <a:avLst/>
+                    </a:prstGeom>
+                  </pic:spPr>
+                </pic:pic>
+              </a:graphicData>
+            </a:graphic>
+          </wp:inline>
+        </w:drawing>
+      </w:r>
+    </w:p>
+    <w:p>
+      <w:pPr>
+        <w:spacing w:after="160"/>
+        <w:jc w:val="center"/>
+      </w:pPr>
+      <w:r>
+        <w:rPr>
+          <w:rFonts w:ascii="Calibri" w:cs="Calibri" w:eastAsia="Calibri" w:hAnsi="Calibri"/>
+          <w:i/>
+          <w:iCs/>
+          <w:color w:val="555555"/>
+          <w:sz w:val="17"/>
+          <w:szCs w:val="17"/>
+        </w:rPr>
+        <w:t xml:space="preserve">Arbre de décision « ne charge pas » : du plus simple et gratuit au plus technique.</w:t>
+      </w:r>
+    </w:p>
+    <w:p>
+      <w:pPr>
         <w:pStyle w:val="Heading2"/>
         <w:spacing w:after="100" w:before="220"/>
       </w:pPr>
@@ -3741,21 +4857,89 @@
       </w:r>
     </w:p>
     <w:p>
+      <w:r>
+        <w:br w:type="page"/>
+      </w:r>
+    </w:p>
+    <w:p>
       <w:pPr>
         <w:pStyle w:val="Heading1"/>
-        <w:spacing w:after="140" w:before="280"/>
-      </w:pPr>
-      <w:r>
-        <w:rPr>
-          <w:rFonts w:ascii="Calibri" w:cs="Calibri" w:eastAsia="Calibri" w:hAnsi="Calibri"/>
-          <w:b/>
-          <w:bCs/>
-          <w:color w:val="1F3A5F"/>
-          <w:sz w:val="32"/>
-          <w:szCs w:val="32"/>
+        <w:spacing w:after="0" w:before="0"/>
+      </w:pPr>
+      <w:r>
+        <w:rPr>
+          <w:rFonts w:ascii="Calibri" w:cs="Calibri" w:eastAsia="Calibri" w:hAnsi="Calibri"/>
+          <w:color w:val="FFFFFF"/>
+          <w:sz w:val="2"/>
+          <w:szCs w:val="2"/>
         </w:rPr>
         <w:t xml:space="preserve">Partie 4 — Tablettes (iPad, Galaxy Tab, etc.)</w:t>
       </w:r>
+    </w:p>
+    <w:tbl>
+      <w:tblPr>
+        <w:tblW w:type="pct" w:w="100%"/>
+        <w:tblBorders>
+          <w:top w:val="none" w:color="FFFFFF" w:sz="0"/>
+          <w:left w:val="none" w:color="FFFFFF" w:sz="0"/>
+          <w:bottom w:val="none" w:color="FFFFFF" w:sz="0"/>
+          <w:right w:val="none" w:color="FFFFFF" w:sz="0"/>
+          <w:insideH w:val="none" w:color="FFFFFF" w:sz="0"/>
+          <w:insideV w:val="none" w:color="FFFFFF" w:sz="0"/>
+        </w:tblBorders>
+      </w:tblPr>
+      <w:tblGrid>
+        <w:gridCol w:w="9360"/>
+      </w:tblGrid>
+      <w:tr>
+        <w:tc>
+          <w:tcPr>
+            <w:tcW w:type="dxa" w:w="9360"/>
+            <w:shd w:fill="1F3A5F" w:color="auto" w:val="clear"/>
+            <w:tcMar>
+              <w:top w:type="dxa" w:w="300"/>
+              <w:left w:type="dxa" w:w="320"/>
+              <w:bottom w:type="dxa" w:w="320"/>
+              <w:right w:type="dxa" w:w="320"/>
+            </w:tcMar>
+          </w:tcPr>
+          <w:p>
+            <w:pPr>
+              <w:spacing w:after="40"/>
+            </w:pPr>
+            <w:r>
+              <w:rPr>
+                <w:rFonts w:ascii="Calibri" w:cs="Calibri" w:eastAsia="Calibri" w:hAnsi="Calibri"/>
+                <w:b/>
+                <w:bCs/>
+                <w:color w:val="9FC4E6"/>
+                <w:spacing w:val="60"/>
+                <w:sz w:val="20"/>
+                <w:szCs w:val="20"/>
+              </w:rPr>
+              <w:t xml:space="preserve">PARTIE 4</w:t>
+            </w:r>
+          </w:p>
+          <w:p>
+            <w:r>
+              <w:rPr>
+                <w:rFonts w:ascii="Calibri" w:cs="Calibri" w:eastAsia="Calibri" w:hAnsi="Calibri"/>
+                <w:b/>
+                <w:bCs/>
+                <w:color w:val="FFFFFF"/>
+                <w:sz w:val="40"/>
+                <w:szCs w:val="40"/>
+              </w:rPr>
+              <w:t xml:space="preserve">Tablettes (iPad, Galaxy Tab, etc.)</w:t>
+            </w:r>
+          </w:p>
+        </w:tc>
+      </w:tr>
+    </w:tbl>
+    <w:p>
+      <w:pPr>
+        <w:spacing w:after="80"/>
+      </w:pPr>
     </w:p>
     <w:p>
       <w:pPr>
@@ -3967,21 +5151,89 @@
       </w:r>
     </w:p>
     <w:p>
+      <w:r>
+        <w:br w:type="page"/>
+      </w:r>
+    </w:p>
+    <w:p>
       <w:pPr>
         <w:pStyle w:val="Heading1"/>
-        <w:spacing w:after="140" w:before="280"/>
-      </w:pPr>
-      <w:r>
-        <w:rPr>
-          <w:rFonts w:ascii="Calibri" w:cs="Calibri" w:eastAsia="Calibri" w:hAnsi="Calibri"/>
-          <w:b/>
-          <w:bCs/>
-          <w:color w:val="1F3A5F"/>
-          <w:sz w:val="32"/>
-          <w:szCs w:val="32"/>
+        <w:spacing w:after="0" w:before="0"/>
+      </w:pPr>
+      <w:r>
+        <w:rPr>
+          <w:rFonts w:ascii="Calibri" w:cs="Calibri" w:eastAsia="Calibri" w:hAnsi="Calibri"/>
+          <w:color w:val="FFFFFF"/>
+          <w:sz w:val="2"/>
+          <w:szCs w:val="2"/>
         </w:rPr>
         <w:t xml:space="preserve">Partie 5 — Réparation des PC portables</w:t>
       </w:r>
+    </w:p>
+    <w:tbl>
+      <w:tblPr>
+        <w:tblW w:type="pct" w:w="100%"/>
+        <w:tblBorders>
+          <w:top w:val="none" w:color="FFFFFF" w:sz="0"/>
+          <w:left w:val="none" w:color="FFFFFF" w:sz="0"/>
+          <w:bottom w:val="none" w:color="FFFFFF" w:sz="0"/>
+          <w:right w:val="none" w:color="FFFFFF" w:sz="0"/>
+          <w:insideH w:val="none" w:color="FFFFFF" w:sz="0"/>
+          <w:insideV w:val="none" w:color="FFFFFF" w:sz="0"/>
+        </w:tblBorders>
+      </w:tblPr>
+      <w:tblGrid>
+        <w:gridCol w:w="9360"/>
+      </w:tblGrid>
+      <w:tr>
+        <w:tc>
+          <w:tcPr>
+            <w:tcW w:type="dxa" w:w="9360"/>
+            <w:shd w:fill="1F3A5F" w:color="auto" w:val="clear"/>
+            <w:tcMar>
+              <w:top w:type="dxa" w:w="300"/>
+              <w:left w:type="dxa" w:w="320"/>
+              <w:bottom w:type="dxa" w:w="320"/>
+              <w:right w:type="dxa" w:w="320"/>
+            </w:tcMar>
+          </w:tcPr>
+          <w:p>
+            <w:pPr>
+              <w:spacing w:after="40"/>
+            </w:pPr>
+            <w:r>
+              <w:rPr>
+                <w:rFonts w:ascii="Calibri" w:cs="Calibri" w:eastAsia="Calibri" w:hAnsi="Calibri"/>
+                <w:b/>
+                <w:bCs/>
+                <w:color w:val="9FC4E6"/>
+                <w:spacing w:val="60"/>
+                <w:sz w:val="20"/>
+                <w:szCs w:val="20"/>
+              </w:rPr>
+              <w:t xml:space="preserve">PARTIE 5</w:t>
+            </w:r>
+          </w:p>
+          <w:p>
+            <w:r>
+              <w:rPr>
+                <w:rFonts w:ascii="Calibri" w:cs="Calibri" w:eastAsia="Calibri" w:hAnsi="Calibri"/>
+                <w:b/>
+                <w:bCs/>
+                <w:color w:val="FFFFFF"/>
+                <w:sz w:val="40"/>
+                <w:szCs w:val="40"/>
+              </w:rPr>
+              <w:t xml:space="preserve">Réparation des PC portables</w:t>
+            </w:r>
+          </w:p>
+        </w:tc>
+      </w:tr>
+    </w:tbl>
+    <w:p>
+      <w:pPr>
+        <w:spacing w:after="80"/>
+      </w:pPr>
     </w:p>
     <w:p>
       <w:pPr>
@@ -4072,6 +5324,69 @@
       <w:pPr>
         <w:spacing w:after="80"/>
       </w:pPr>
+    </w:p>
+    <w:p>
+      <w:pPr>
+        <w:spacing w:after="40" w:before="120"/>
+        <w:jc w:val="center"/>
+      </w:pPr>
+      <w:r>
+        <w:drawing>
+          <wp:inline distT="0" distB="0" distL="0" distR="0">
+            <wp:extent cx="4476750" cy="2143125"/>
+            <wp:effectExtent t="0" r="0" b="0" l="0"/>
+            <wp:docPr id="1" name="" descr="" title=""/>
+            <wp:cNvGraphicFramePr>
+              <a:graphicFrameLocks xmlns:a="http://schemas.openxmlformats.org/drawingml/2006/main" noChangeAspect="1"/>
+            </wp:cNvGraphicFramePr>
+            <a:graphic xmlns:a="http://schemas.openxmlformats.org/drawingml/2006/main">
+              <a:graphicData uri="http://schemas.openxmlformats.org/drawingml/2006/picture">
+                <pic:pic xmlns:pic="http://schemas.openxmlformats.org/drawingml/2006/picture">
+                  <pic:nvPicPr>
+                    <pic:cNvPr id="0" name="" descr=""/>
+                    <pic:cNvPicPr>
+                      <a:picLocks noChangeAspect="1" noChangeArrowheads="1"/>
+                    </pic:cNvPicPr>
+                  </pic:nvPicPr>
+                  <pic:blipFill>
+                    <a:blip r:embed="rId14" cstate="none"/>
+                    <a:srcRect/>
+                    <a:stretch>
+                      <a:fillRect/>
+                    </a:stretch>
+                  </pic:blipFill>
+                  <pic:spPr bwMode="auto">
+                    <a:xfrm>
+                      <a:off x="0" y="0"/>
+                      <a:ext cx="4476750" cy="2143125"/>
+                    </a:xfrm>
+                    <a:prstGeom prst="rect">
+                      <a:avLst/>
+                    </a:prstGeom>
+                  </pic:spPr>
+                </pic:pic>
+              </a:graphicData>
+            </a:graphic>
+          </wp:inline>
+        </w:drawing>
+      </w:r>
+    </w:p>
+    <w:p>
+      <w:pPr>
+        <w:spacing w:after="160"/>
+        <w:jc w:val="center"/>
+      </w:pPr>
+      <w:r>
+        <w:rPr>
+          <w:rFonts w:ascii="Calibri" w:cs="Calibri" w:eastAsia="Calibri" w:hAnsi="Calibri"/>
+          <w:i/>
+          <w:iCs/>
+          <w:color w:val="555555"/>
+          <w:sz w:val="17"/>
+          <w:szCs w:val="17"/>
+        </w:rPr>
+        <w:t xml:space="preserve">Disposition type d'un PC portable et interventions les plus fréquentes.</w:t>
+      </w:r>
     </w:p>
     <w:p>
       <w:pPr>
@@ -4959,21 +6274,89 @@
       </w:r>
     </w:p>
     <w:p>
+      <w:r>
+        <w:br w:type="page"/>
+      </w:r>
+    </w:p>
+    <w:p>
       <w:pPr>
         <w:pStyle w:val="Heading1"/>
-        <w:spacing w:after="140" w:before="280"/>
-      </w:pPr>
-      <w:r>
-        <w:rPr>
-          <w:rFonts w:ascii="Calibri" w:cs="Calibri" w:eastAsia="Calibri" w:hAnsi="Calibri"/>
-          <w:b/>
-          <w:bCs/>
-          <w:color w:val="1F3A5F"/>
-          <w:sz w:val="32"/>
-          <w:szCs w:val="32"/>
+        <w:spacing w:after="0" w:before="0"/>
+      </w:pPr>
+      <w:r>
+        <w:rPr>
+          <w:rFonts w:ascii="Calibri" w:cs="Calibri" w:eastAsia="Calibri" w:hAnsi="Calibri"/>
+          <w:color w:val="FFFFFF"/>
+          <w:sz w:val="2"/>
+          <w:szCs w:val="2"/>
         </w:rPr>
         <w:t xml:space="preserve">Partie 6 — Smartwatchs (Apple Watch et montres connectées)</w:t>
       </w:r>
+    </w:p>
+    <w:tbl>
+      <w:tblPr>
+        <w:tblW w:type="pct" w:w="100%"/>
+        <w:tblBorders>
+          <w:top w:val="none" w:color="FFFFFF" w:sz="0"/>
+          <w:left w:val="none" w:color="FFFFFF" w:sz="0"/>
+          <w:bottom w:val="none" w:color="FFFFFF" w:sz="0"/>
+          <w:right w:val="none" w:color="FFFFFF" w:sz="0"/>
+          <w:insideH w:val="none" w:color="FFFFFF" w:sz="0"/>
+          <w:insideV w:val="none" w:color="FFFFFF" w:sz="0"/>
+        </w:tblBorders>
+      </w:tblPr>
+      <w:tblGrid>
+        <w:gridCol w:w="9360"/>
+      </w:tblGrid>
+      <w:tr>
+        <w:tc>
+          <w:tcPr>
+            <w:tcW w:type="dxa" w:w="9360"/>
+            <w:shd w:fill="1F3A5F" w:color="auto" w:val="clear"/>
+            <w:tcMar>
+              <w:top w:type="dxa" w:w="300"/>
+              <w:left w:type="dxa" w:w="320"/>
+              <w:bottom w:type="dxa" w:w="320"/>
+              <w:right w:type="dxa" w:w="320"/>
+            </w:tcMar>
+          </w:tcPr>
+          <w:p>
+            <w:pPr>
+              <w:spacing w:after="40"/>
+            </w:pPr>
+            <w:r>
+              <w:rPr>
+                <w:rFonts w:ascii="Calibri" w:cs="Calibri" w:eastAsia="Calibri" w:hAnsi="Calibri"/>
+                <w:b/>
+                <w:bCs/>
+                <w:color w:val="9FC4E6"/>
+                <w:spacing w:val="60"/>
+                <w:sz w:val="20"/>
+                <w:szCs w:val="20"/>
+              </w:rPr>
+              <w:t xml:space="preserve">PARTIE 6</w:t>
+            </w:r>
+          </w:p>
+          <w:p>
+            <w:r>
+              <w:rPr>
+                <w:rFonts w:ascii="Calibri" w:cs="Calibri" w:eastAsia="Calibri" w:hAnsi="Calibri"/>
+                <w:b/>
+                <w:bCs/>
+                <w:color w:val="FFFFFF"/>
+                <w:sz w:val="40"/>
+                <w:szCs w:val="40"/>
+              </w:rPr>
+              <w:t xml:space="preserve">Smartwatchs (Apple Watch et montres connectées)</w:t>
+            </w:r>
+          </w:p>
+        </w:tc>
+      </w:tr>
+    </w:tbl>
+    <w:p>
+      <w:pPr>
+        <w:spacing w:after="80"/>
+      </w:pPr>
     </w:p>
     <w:p>
       <w:pPr>
@@ -5167,21 +6550,89 @@
       </w:r>
     </w:p>
     <w:p>
+      <w:r>
+        <w:br w:type="page"/>
+      </w:r>
+    </w:p>
+    <w:p>
       <w:pPr>
         <w:pStyle w:val="Heading1"/>
-        <w:spacing w:after="140" w:before="280"/>
-      </w:pPr>
-      <w:r>
-        <w:rPr>
-          <w:rFonts w:ascii="Calibri" w:cs="Calibri" w:eastAsia="Calibri" w:hAnsi="Calibri"/>
-          <w:b/>
-          <w:bCs/>
-          <w:color w:val="1F3A5F"/>
-          <w:sz w:val="32"/>
-          <w:szCs w:val="32"/>
+        <w:spacing w:after="0" w:before="0"/>
+      </w:pPr>
+      <w:r>
+        <w:rPr>
+          <w:rFonts w:ascii="Calibri" w:cs="Calibri" w:eastAsia="Calibri" w:hAnsi="Calibri"/>
+          <w:color w:val="FFFFFF"/>
+          <w:sz w:val="2"/>
+          <w:szCs w:val="2"/>
         </w:rPr>
         <w:t xml:space="preserve">Partie 7 — AirPods et écouteurs sans fil</w:t>
       </w:r>
+    </w:p>
+    <w:tbl>
+      <w:tblPr>
+        <w:tblW w:type="pct" w:w="100%"/>
+        <w:tblBorders>
+          <w:top w:val="none" w:color="FFFFFF" w:sz="0"/>
+          <w:left w:val="none" w:color="FFFFFF" w:sz="0"/>
+          <w:bottom w:val="none" w:color="FFFFFF" w:sz="0"/>
+          <w:right w:val="none" w:color="FFFFFF" w:sz="0"/>
+          <w:insideH w:val="none" w:color="FFFFFF" w:sz="0"/>
+          <w:insideV w:val="none" w:color="FFFFFF" w:sz="0"/>
+        </w:tblBorders>
+      </w:tblPr>
+      <w:tblGrid>
+        <w:gridCol w:w="9360"/>
+      </w:tblGrid>
+      <w:tr>
+        <w:tc>
+          <w:tcPr>
+            <w:tcW w:type="dxa" w:w="9360"/>
+            <w:shd w:fill="1F3A5F" w:color="auto" w:val="clear"/>
+            <w:tcMar>
+              <w:top w:type="dxa" w:w="300"/>
+              <w:left w:type="dxa" w:w="320"/>
+              <w:bottom w:type="dxa" w:w="320"/>
+              <w:right w:type="dxa" w:w="320"/>
+            </w:tcMar>
+          </w:tcPr>
+          <w:p>
+            <w:pPr>
+              <w:spacing w:after="40"/>
+            </w:pPr>
+            <w:r>
+              <w:rPr>
+                <w:rFonts w:ascii="Calibri" w:cs="Calibri" w:eastAsia="Calibri" w:hAnsi="Calibri"/>
+                <w:b/>
+                <w:bCs/>
+                <w:color w:val="9FC4E6"/>
+                <w:spacing w:val="60"/>
+                <w:sz w:val="20"/>
+                <w:szCs w:val="20"/>
+              </w:rPr>
+              <w:t xml:space="preserve">PARTIE 7</w:t>
+            </w:r>
+          </w:p>
+          <w:p>
+            <w:r>
+              <w:rPr>
+                <w:rFonts w:ascii="Calibri" w:cs="Calibri" w:eastAsia="Calibri" w:hAnsi="Calibri"/>
+                <w:b/>
+                <w:bCs/>
+                <w:color w:val="FFFFFF"/>
+                <w:sz w:val="40"/>
+                <w:szCs w:val="40"/>
+              </w:rPr>
+              <w:t xml:space="preserve">AirPods et écouteurs sans fil</w:t>
+            </w:r>
+          </w:p>
+        </w:tc>
+      </w:tr>
+    </w:tbl>
+    <w:p>
+      <w:pPr>
+        <w:spacing w:after="80"/>
+      </w:pPr>
     </w:p>
     <w:p>
       <w:pPr>
@@ -5195,6 +6646,69 @@
           <w:szCs w:val="22"/>
         </w:rPr>
         <w:t xml:space="preserve">Les AirPods (et écouteurs « true wireless » en général) sont conçus pour être scellés : ils sont assemblés à la colle et aux ultrasons, sans vis. Cela limite fortement les réparations possibles — il faut le savoir et le dire au client.</w:t>
+      </w:r>
+    </w:p>
+    <w:p>
+      <w:pPr>
+        <w:spacing w:after="40" w:before="120"/>
+        <w:jc w:val="center"/>
+      </w:pPr>
+      <w:r>
+        <w:drawing>
+          <wp:inline distT="0" distB="0" distL="0" distR="0">
+            <wp:extent cx="4476750" cy="1790700"/>
+            <wp:effectExtent t="0" r="0" b="0" l="0"/>
+            <wp:docPr id="1" name="" descr="" title=""/>
+            <wp:cNvGraphicFramePr>
+              <a:graphicFrameLocks xmlns:a="http://schemas.openxmlformats.org/drawingml/2006/main" noChangeAspect="1"/>
+            </wp:cNvGraphicFramePr>
+            <a:graphic xmlns:a="http://schemas.openxmlformats.org/drawingml/2006/main">
+              <a:graphicData uri="http://schemas.openxmlformats.org/drawingml/2006/picture">
+                <pic:pic xmlns:pic="http://schemas.openxmlformats.org/drawingml/2006/picture">
+                  <pic:nvPicPr>
+                    <pic:cNvPr id="0" name="" descr=""/>
+                    <pic:cNvPicPr>
+                      <a:picLocks noChangeAspect="1" noChangeArrowheads="1"/>
+                    </pic:cNvPicPr>
+                  </pic:nvPicPr>
+                  <pic:blipFill>
+                    <a:blip r:embed="rId15" cstate="none"/>
+                    <a:srcRect/>
+                    <a:stretch>
+                      <a:fillRect/>
+                    </a:stretch>
+                  </pic:blipFill>
+                  <pic:spPr bwMode="auto">
+                    <a:xfrm>
+                      <a:off x="0" y="0"/>
+                      <a:ext cx="4476750" cy="1790700"/>
+                    </a:xfrm>
+                    <a:prstGeom prst="rect">
+                      <a:avLst/>
+                    </a:prstGeom>
+                  </pic:spPr>
+                </pic:pic>
+              </a:graphicData>
+            </a:graphic>
+          </wp:inline>
+        </w:drawing>
+      </w:r>
+    </w:p>
+    <w:p>
+      <w:pPr>
+        <w:spacing w:after="160"/>
+        <w:jc w:val="center"/>
+      </w:pPr>
+      <w:r>
+        <w:rPr>
+          <w:rFonts w:ascii="Calibri" w:cs="Calibri" w:eastAsia="Calibri" w:hAnsi="Calibri"/>
+          <w:i/>
+          <w:iCs/>
+          <w:color w:val="555555"/>
+          <w:sz w:val="17"/>
+          <w:szCs w:val="17"/>
+        </w:rPr>
+        <w:t xml:space="preserve">Ce qui est réellement réparable sur des écouteurs sans fil — et ce qui ne l'est pas.</w:t>
       </w:r>
     </w:p>
     <w:p>
@@ -5468,21 +6982,89 @@
       </w:r>
     </w:p>
     <w:p>
+      <w:r>
+        <w:br w:type="page"/>
+      </w:r>
+    </w:p>
+    <w:p>
       <w:pPr>
         <w:pStyle w:val="Heading1"/>
-        <w:spacing w:after="140" w:before="280"/>
-      </w:pPr>
-      <w:r>
-        <w:rPr>
-          <w:rFonts w:ascii="Calibri" w:cs="Calibri" w:eastAsia="Calibri" w:hAnsi="Calibri"/>
-          <w:b/>
-          <w:bCs/>
-          <w:color w:val="1F3A5F"/>
-          <w:sz w:val="32"/>
-          <w:szCs w:val="32"/>
+        <w:spacing w:after="0" w:before="0"/>
+      </w:pPr>
+      <w:r>
+        <w:rPr>
+          <w:rFonts w:ascii="Calibri" w:cs="Calibri" w:eastAsia="Calibri" w:hAnsi="Calibri"/>
+          <w:color w:val="FFFFFF"/>
+          <w:sz w:val="2"/>
+          <w:szCs w:val="2"/>
         </w:rPr>
         <w:t xml:space="preserve">Partie 8 — Micro-soudure et réparation de carte mère (niveau avancé)</w:t>
       </w:r>
+    </w:p>
+    <w:tbl>
+      <w:tblPr>
+        <w:tblW w:type="pct" w:w="100%"/>
+        <w:tblBorders>
+          <w:top w:val="none" w:color="FFFFFF" w:sz="0"/>
+          <w:left w:val="none" w:color="FFFFFF" w:sz="0"/>
+          <w:bottom w:val="none" w:color="FFFFFF" w:sz="0"/>
+          <w:right w:val="none" w:color="FFFFFF" w:sz="0"/>
+          <w:insideH w:val="none" w:color="FFFFFF" w:sz="0"/>
+          <w:insideV w:val="none" w:color="FFFFFF" w:sz="0"/>
+        </w:tblBorders>
+      </w:tblPr>
+      <w:tblGrid>
+        <w:gridCol w:w="9360"/>
+      </w:tblGrid>
+      <w:tr>
+        <w:tc>
+          <w:tcPr>
+            <w:tcW w:type="dxa" w:w="9360"/>
+            <w:shd w:fill="1F3A5F" w:color="auto" w:val="clear"/>
+            <w:tcMar>
+              <w:top w:type="dxa" w:w="300"/>
+              <w:left w:type="dxa" w:w="320"/>
+              <w:bottom w:type="dxa" w:w="320"/>
+              <w:right w:type="dxa" w:w="320"/>
+            </w:tcMar>
+          </w:tcPr>
+          <w:p>
+            <w:pPr>
+              <w:spacing w:after="40"/>
+            </w:pPr>
+            <w:r>
+              <w:rPr>
+                <w:rFonts w:ascii="Calibri" w:cs="Calibri" w:eastAsia="Calibri" w:hAnsi="Calibri"/>
+                <w:b/>
+                <w:bCs/>
+                <w:color w:val="9FC4E6"/>
+                <w:spacing w:val="60"/>
+                <w:sz w:val="20"/>
+                <w:szCs w:val="20"/>
+              </w:rPr>
+              <w:t xml:space="preserve">PARTIE 8</w:t>
+            </w:r>
+          </w:p>
+          <w:p>
+            <w:r>
+              <w:rPr>
+                <w:rFonts w:ascii="Calibri" w:cs="Calibri" w:eastAsia="Calibri" w:hAnsi="Calibri"/>
+                <w:b/>
+                <w:bCs/>
+                <w:color w:val="FFFFFF"/>
+                <w:sz w:val="40"/>
+                <w:szCs w:val="40"/>
+              </w:rPr>
+              <w:t xml:space="preserve">Micro-soudure et réparation de carte mère (niveau avancé)</w:t>
+            </w:r>
+          </w:p>
+        </w:tc>
+      </w:tr>
+    </w:tbl>
+    <w:p>
+      <w:pPr>
+        <w:spacing w:after="80"/>
+      </w:pPr>
     </w:p>
     <w:p>
       <w:pPr>
@@ -5935,21 +7517,89 @@
       </w:r>
     </w:p>
     <w:p>
+      <w:r>
+        <w:br w:type="page"/>
+      </w:r>
+    </w:p>
+    <w:p>
       <w:pPr>
         <w:pStyle w:val="Heading1"/>
-        <w:spacing w:after="140" w:before="280"/>
-      </w:pPr>
-      <w:r>
-        <w:rPr>
-          <w:rFonts w:ascii="Calibri" w:cs="Calibri" w:eastAsia="Calibri" w:hAnsi="Calibri"/>
-          <w:b/>
-          <w:bCs/>
-          <w:color w:val="1F3A5F"/>
-          <w:sz w:val="32"/>
-          <w:szCs w:val="32"/>
+        <w:spacing w:after="0" w:before="0"/>
+      </w:pPr>
+      <w:r>
+        <w:rPr>
+          <w:rFonts w:ascii="Calibri" w:cs="Calibri" w:eastAsia="Calibri" w:hAnsi="Calibri"/>
+          <w:color w:val="FFFFFF"/>
+          <w:sz w:val="2"/>
+          <w:szCs w:val="2"/>
         </w:rPr>
         <w:t xml:space="preserve">Partie 9 — Logiciel, flashage et récupération de données</w:t>
       </w:r>
+    </w:p>
+    <w:tbl>
+      <w:tblPr>
+        <w:tblW w:type="pct" w:w="100%"/>
+        <w:tblBorders>
+          <w:top w:val="none" w:color="FFFFFF" w:sz="0"/>
+          <w:left w:val="none" w:color="FFFFFF" w:sz="0"/>
+          <w:bottom w:val="none" w:color="FFFFFF" w:sz="0"/>
+          <w:right w:val="none" w:color="FFFFFF" w:sz="0"/>
+          <w:insideH w:val="none" w:color="FFFFFF" w:sz="0"/>
+          <w:insideV w:val="none" w:color="FFFFFF" w:sz="0"/>
+        </w:tblBorders>
+      </w:tblPr>
+      <w:tblGrid>
+        <w:gridCol w:w="9360"/>
+      </w:tblGrid>
+      <w:tr>
+        <w:tc>
+          <w:tcPr>
+            <w:tcW w:type="dxa" w:w="9360"/>
+            <w:shd w:fill="1F3A5F" w:color="auto" w:val="clear"/>
+            <w:tcMar>
+              <w:top w:type="dxa" w:w="300"/>
+              <w:left w:type="dxa" w:w="320"/>
+              <w:bottom w:type="dxa" w:w="320"/>
+              <w:right w:type="dxa" w:w="320"/>
+            </w:tcMar>
+          </w:tcPr>
+          <w:p>
+            <w:pPr>
+              <w:spacing w:after="40"/>
+            </w:pPr>
+            <w:r>
+              <w:rPr>
+                <w:rFonts w:ascii="Calibri" w:cs="Calibri" w:eastAsia="Calibri" w:hAnsi="Calibri"/>
+                <w:b/>
+                <w:bCs/>
+                <w:color w:val="9FC4E6"/>
+                <w:spacing w:val="60"/>
+                <w:sz w:val="20"/>
+                <w:szCs w:val="20"/>
+              </w:rPr>
+              <w:t xml:space="preserve">PARTIE 9</w:t>
+            </w:r>
+          </w:p>
+          <w:p>
+            <w:r>
+              <w:rPr>
+                <w:rFonts w:ascii="Calibri" w:cs="Calibri" w:eastAsia="Calibri" w:hAnsi="Calibri"/>
+                <w:b/>
+                <w:bCs/>
+                <w:color w:val="FFFFFF"/>
+                <w:sz w:val="40"/>
+                <w:szCs w:val="40"/>
+              </w:rPr>
+              <w:t xml:space="preserve">Logiciel, flashage et récupération de données</w:t>
+            </w:r>
+          </w:p>
+        </w:tc>
+      </w:tr>
+    </w:tbl>
+    <w:p>
+      <w:pPr>
+        <w:spacing w:after="80"/>
+      </w:pPr>
     </w:p>
     <w:p>
       <w:pPr>
@@ -6203,21 +7853,89 @@
       </w:r>
     </w:p>
     <w:p>
+      <w:r>
+        <w:br w:type="page"/>
+      </w:r>
+    </w:p>
+    <w:p>
       <w:pPr>
         <w:pStyle w:val="Heading1"/>
-        <w:spacing w:after="140" w:before="280"/>
-      </w:pPr>
-      <w:r>
-        <w:rPr>
-          <w:rFonts w:ascii="Calibri" w:cs="Calibri" w:eastAsia="Calibri" w:hAnsi="Calibri"/>
-          <w:b/>
-          <w:bCs/>
-          <w:color w:val="1F3A5F"/>
-          <w:sz w:val="32"/>
-          <w:szCs w:val="32"/>
+        <w:spacing w:after="0" w:before="0"/>
+      </w:pPr>
+      <w:r>
+        <w:rPr>
+          <w:rFonts w:ascii="Calibri" w:cs="Calibri" w:eastAsia="Calibri" w:hAnsi="Calibri"/>
+          <w:color w:val="FFFFFF"/>
+          <w:sz w:val="2"/>
+          <w:szCs w:val="2"/>
         </w:rPr>
         <w:t xml:space="preserve">Partie 10 — Le business de la réparation</w:t>
       </w:r>
+    </w:p>
+    <w:tbl>
+      <w:tblPr>
+        <w:tblW w:type="pct" w:w="100%"/>
+        <w:tblBorders>
+          <w:top w:val="none" w:color="FFFFFF" w:sz="0"/>
+          <w:left w:val="none" w:color="FFFFFF" w:sz="0"/>
+          <w:bottom w:val="none" w:color="FFFFFF" w:sz="0"/>
+          <w:right w:val="none" w:color="FFFFFF" w:sz="0"/>
+          <w:insideH w:val="none" w:color="FFFFFF" w:sz="0"/>
+          <w:insideV w:val="none" w:color="FFFFFF" w:sz="0"/>
+        </w:tblBorders>
+      </w:tblPr>
+      <w:tblGrid>
+        <w:gridCol w:w="9360"/>
+      </w:tblGrid>
+      <w:tr>
+        <w:tc>
+          <w:tcPr>
+            <w:tcW w:type="dxa" w:w="9360"/>
+            <w:shd w:fill="1F3A5F" w:color="auto" w:val="clear"/>
+            <w:tcMar>
+              <w:top w:type="dxa" w:w="300"/>
+              <w:left w:type="dxa" w:w="320"/>
+              <w:bottom w:type="dxa" w:w="320"/>
+              <w:right w:type="dxa" w:w="320"/>
+            </w:tcMar>
+          </w:tcPr>
+          <w:p>
+            <w:pPr>
+              <w:spacing w:after="40"/>
+            </w:pPr>
+            <w:r>
+              <w:rPr>
+                <w:rFonts w:ascii="Calibri" w:cs="Calibri" w:eastAsia="Calibri" w:hAnsi="Calibri"/>
+                <w:b/>
+                <w:bCs/>
+                <w:color w:val="9FC4E6"/>
+                <w:spacing w:val="60"/>
+                <w:sz w:val="20"/>
+                <w:szCs w:val="20"/>
+              </w:rPr>
+              <w:t xml:space="preserve">PARTIE 10</w:t>
+            </w:r>
+          </w:p>
+          <w:p>
+            <w:r>
+              <w:rPr>
+                <w:rFonts w:ascii="Calibri" w:cs="Calibri" w:eastAsia="Calibri" w:hAnsi="Calibri"/>
+                <w:b/>
+                <w:bCs/>
+                <w:color w:val="FFFFFF"/>
+                <w:sz w:val="40"/>
+                <w:szCs w:val="40"/>
+              </w:rPr>
+              <w:t xml:space="preserve">Le business de la réparation</w:t>
+            </w:r>
+          </w:p>
+        </w:tc>
+      </w:tr>
+    </w:tbl>
+    <w:p>
+      <w:pPr>
+        <w:spacing w:after="80"/>
+      </w:pPr>
     </w:p>
     <w:p>
       <w:pPr>
@@ -6596,6 +8314,69 @@
       <w:pPr>
         <w:spacing w:after="80"/>
       </w:pPr>
+    </w:p>
+    <w:p>
+      <w:pPr>
+        <w:spacing w:after="40" w:before="120"/>
+        <w:jc w:val="center"/>
+      </w:pPr>
+      <w:r>
+        <w:drawing>
+          <wp:inline distT="0" distB="0" distL="0" distR="0">
+            <wp:extent cx="4476750" cy="1885950"/>
+            <wp:effectExtent t="0" r="0" b="0" l="0"/>
+            <wp:docPr id="1" name="" descr="" title=""/>
+            <wp:cNvGraphicFramePr>
+              <a:graphicFrameLocks xmlns:a="http://schemas.openxmlformats.org/drawingml/2006/main" noChangeAspect="1"/>
+            </wp:cNvGraphicFramePr>
+            <a:graphic xmlns:a="http://schemas.openxmlformats.org/drawingml/2006/main">
+              <a:graphicData uri="http://schemas.openxmlformats.org/drawingml/2006/picture">
+                <pic:pic xmlns:pic="http://schemas.openxmlformats.org/drawingml/2006/picture">
+                  <pic:nvPicPr>
+                    <pic:cNvPr id="0" name="" descr=""/>
+                    <pic:cNvPicPr>
+                      <a:picLocks noChangeAspect="1" noChangeArrowheads="1"/>
+                    </pic:cNvPicPr>
+                  </pic:nvPicPr>
+                  <pic:blipFill>
+                    <a:blip r:embed="rId16" cstate="none"/>
+                    <a:srcRect/>
+                    <a:stretch>
+                      <a:fillRect/>
+                    </a:stretch>
+                  </pic:blipFill>
+                  <pic:spPr bwMode="auto">
+                    <a:xfrm>
+                      <a:off x="0" y="0"/>
+                      <a:ext cx="4476750" cy="1885950"/>
+                    </a:xfrm>
+                    <a:prstGeom prst="rect">
+                      <a:avLst/>
+                    </a:prstGeom>
+                  </pic:spPr>
+                </pic:pic>
+              </a:graphicData>
+            </a:graphic>
+          </wp:inline>
+        </w:drawing>
+      </w:r>
+    </w:p>
+    <w:p>
+      <w:pPr>
+        <w:spacing w:after="160"/>
+        <w:jc w:val="center"/>
+      </w:pPr>
+      <w:r>
+        <w:rPr>
+          <w:rFonts w:ascii="Calibri" w:cs="Calibri" w:eastAsia="Calibri" w:hAnsi="Calibri"/>
+          <w:i/>
+          <w:iCs/>
+          <w:color w:val="555555"/>
+          <w:sz w:val="17"/>
+          <w:szCs w:val="17"/>
+        </w:rPr>
+        <w:t xml:space="preserve">La structure de prix d'une intervention : la marge se fait sur la pièce ET la main-d'œuvre.</w:t>
+      </w:r>
     </w:p>
     <w:p>
       <w:pPr>

</xml_diff>